<commit_message>
Append branch history to production bible documents
</commit_message>
<xml_diff>
--- a/.github/workflows/GATES-main/app/codicon.css-main/Codicon Hacking — Season Production Bible.docx
+++ b/.github/workflows/GATES-main/app/codicon.css-main/Codicon Hacking — Season Production Bible.docx
@@ -1,6 +1,6 @@
 
 <file path=word/document.xml><?xml version="1.0" encoding="utf-8"?>
-<w:document xmlns:wpc="http://schemas.microsoft.com/office/word/2010/wordprocessingCanvas" xmlns:mc="http://schemas.openxmlformats.org/markup-compatibility/2006" xmlns:o="urn:schemas-microsoft-com:office:office" xmlns:r="http://schemas.openxmlformats.org/officeDocument/2006/relationships" xmlns:m="http://schemas.openxmlformats.org/officeDocument/2006/math" xmlns:v="urn:schemas-microsoft-com:vml" xmlns:wp14="http://schemas.microsoft.com/office/word/2010/wordprocessingDrawing" xmlns:wp="http://schemas.openxmlformats.org/drawingml/2006/wordprocessingDrawing" xmlns:w10="urn:schemas-microsoft-com:office:word" xmlns:w="http://schemas.openxmlformats.org/wordprocessingml/2006/main" xmlns:w14="http://schemas.microsoft.com/office/word/2010/wordml" xmlns:w15="http://schemas.microsoft.com/office/word/2012/wordml" xmlns:wpg="http://schemas.microsoft.com/office/word/2010/wordprocessingGroup" xmlns:wpi="http://schemas.microsoft.com/office/word/2010/wordprocessingInk" xmlns:wne="http://schemas.microsoft.com/office/word/2006/wordml" xmlns:wps="http://schemas.microsoft.com/office/word/2010/wordprocessingShape" xmlns:cx="http://schemas.microsoft.com/office/drawing/2014/chartex" xmlns:cx1="http://schemas.microsoft.com/office/drawing/2015/9/8/chartex" xmlns:cx2="http://schemas.microsoft.com/office/drawing/2015/10/21/chartex" xmlns:cx3="http://schemas.microsoft.com/office/drawing/2016/5/9/chartex" xmlns:cx4="http://schemas.microsoft.com/office/drawing/2016/5/10/chartex" xmlns:cx5="http://schemas.microsoft.com/office/drawing/2016/5/11/chartex" xmlns:cx6="http://schemas.microsoft.com/office/drawing/2016/5/12/chartex" xmlns:cx7="http://schemas.microsoft.com/office/drawing/2016/5/13/chartex" xmlns:cx8="http://schemas.microsoft.com/office/drawing/2016/5/14/chartex" xmlns:aink="http://schemas.microsoft.com/office/drawing/2016/ink" xmlns:am3d="http://schemas.microsoft.com/office/drawing/2017/model3d" xmlns:w16cex="http://schemas.microsoft.com/office/word/2018/wordml/cex" xmlns:w16cid="http://schemas.microsoft.com/office/word/2016/wordml/cid" xmlns:w16="http://schemas.microsoft.com/office/word/2018/wordml" xmlns:w16sdtdh="http://schemas.microsoft.com/office/word/2020/wordml/sdtdatahash" xmlns:w16se="http://schemas.microsoft.com/office/word/2015/wordml/symex" mc:Ignorable="w14 w15 wp14">
+<w:document xmlns:ns1="http://schemas.openxmlformats.org/markup-compatibility/2006" xmlns:w="http://schemas.openxmlformats.org/wordprocessingml/2006/main" ns1:Ignorable="w14 w15 wp14">
   <w:body>
     <w:p>
       <w:pPr>
@@ -34664,6 +34664,34 @@
           <w:szCs w:val="22"/>
         </w:rPr>
         <w:t xml:space="preserve">01000011 01001111 01000100 01001001 01000011 01001111 01001110</w:t>
+      </w:r>
+    </w:p>
+    <w:p>
+      <w:pPr>
+        <w:spacing w:after="240" w:line="240" w:lineRule="auto"/>
+      </w:pPr>
+      <w:r>
+        <w:t xml:space="preserve">* copilot/c45f481</w:t>
+        <w:br/>
+      </w:r>
+      <w:r>
+        <w:t xml:space="preserve">  remotes/origin/copilot/c45f481</w:t>
+        <w:br/>
+      </w:r>
+      <w:r>
+        <w:t xml:space="preserve">---</w:t>
+        <w:br/>
+      </w:r>
+      <w:r>
+        <w:t xml:space="preserve">30c3c24 (HEAD -&gt; copilot/c45f481, origin/copilot/c45f481) Merge pull request #5 from Cleanskiier27/copilot/hidden-secrets-and-safety</w:t>
+        <w:br/>
+      </w:r>
+      <w:r>
+        <w:t xml:space="preserve">b4d3d39 (grafted) Rebrand repo landing content for space economy tax</w:t>
+        <w:br/>
+      </w:r>
+      <w:r>
+        <w:t xml:space="preserve">f2114f7 (grafted) Merge pull request #4 from Cleanskiier27/copilot/4a26f74-fix-sync</w:t>
       </w:r>
     </w:p>
     <w:sectPr>

</xml_diff>